<commit_message>
Fix number input handling for empty values across forms
</commit_message>
<xml_diff>
--- a/poultry documentation.docx
+++ b/poultry documentation.docx
@@ -19,15 +19,7 @@
     </w:p>
     <w:p>
       <w:r>
-        <w:t xml:space="preserve">This guide provides a comprehensive overview of how to create, monitor, and manage poultry batches within the </w:t>
-      </w:r>
-      <w:proofErr w:type="spellStart"/>
-      <w:r>
-        <w:t>Poultrix</w:t>
-      </w:r>
-      <w:proofErr w:type="spellEnd"/>
-      <w:r>
-        <w:t xml:space="preserve"> application. A "batch" represents a specific group of birds being raised in a shed, tracked from a start date.</w:t>
+        <w:t>This guide provides a comprehensive overview of how to create, monitor, and manage poultry batches within the Poultrix application. A "batch" represents a specific group of birds being raised in a shed, tracked from a start date.</w:t>
       </w:r>
     </w:p>
     <w:p>
@@ -77,10 +69,7 @@
         <w:t>Add New Batch</w:t>
       </w:r>
       <w:r>
-        <w:t xml:space="preserve"> </w:t>
-      </w:r>
-      <w:r>
-        <w:t>screen</w:t>
+        <w:t xml:space="preserve"> screen</w:t>
       </w:r>
       <w:r>
         <w:t>.</w:t>
@@ -571,36 +560,12 @@
           <w:b/>
           <w:bCs/>
         </w:rPr>
-        <w:t xml:space="preserve">4. </w:t>
-      </w:r>
-      <w:proofErr w:type="spellStart"/>
-      <w:r>
-        <w:rPr>
-          <w:b/>
-          <w:bCs/>
-        </w:rPr>
-        <w:t>Analyzing</w:t>
-      </w:r>
-      <w:proofErr w:type="spellEnd"/>
-      <w:r>
-        <w:rPr>
-          <w:b/>
-          <w:bCs/>
-        </w:rPr>
-        <w:t xml:space="preserve"> Batch Performance and Reports</w:t>
-      </w:r>
-    </w:p>
-    <w:p>
-      <w:r>
-        <w:t xml:space="preserve">The application provides powerful tools for </w:t>
-      </w:r>
-      <w:proofErr w:type="spellStart"/>
-      <w:r>
-        <w:t>analyzing</w:t>
-      </w:r>
-      <w:proofErr w:type="spellEnd"/>
-      <w:r>
-        <w:t xml:space="preserve"> the performance of your batches over time.</w:t>
+        <w:t>4. Analyzing Batch Performance and Reports</w:t>
+      </w:r>
+    </w:p>
+    <w:p>
+      <w:r>
+        <w:t>The application provides powerful tools for analyzing the performance of your batches over time.</w:t>
       </w:r>
     </w:p>
     <w:p>
@@ -942,15 +907,7 @@
     </w:p>
     <w:p>
       <w:r>
-        <w:t xml:space="preserve">This section details the standard workflow for managing inventory, business partners, purchases, and sales within the </w:t>
-      </w:r>
-      <w:proofErr w:type="spellStart"/>
-      <w:r>
-        <w:t>Poultrix</w:t>
-      </w:r>
-      <w:proofErr w:type="spellEnd"/>
-      <w:r>
-        <w:t xml:space="preserve"> application.</w:t>
+        <w:t>This section details the standard workflow for managing inventory, business partners, purchases, and sales within the Poultrix application.</w:t>
       </w:r>
     </w:p>
     <w:p>
@@ -1092,15 +1049,7 @@
         </w:numPr>
       </w:pPr>
       <w:r>
-        <w:t xml:space="preserve">Fill in the item details, such as Item Name, Category (e.g., Feed, Medicine, Packaging), Unit of Measure (e.g., kg, </w:t>
-      </w:r>
-      <w:proofErr w:type="spellStart"/>
-      <w:r>
-        <w:t>ltr</w:t>
-      </w:r>
-      <w:proofErr w:type="spellEnd"/>
-      <w:r>
-        <w:t>, pcs), and initial Opening Stock quantity and Value.</w:t>
+        <w:t>Fill in the item details, such as Item Name, Category (e.g., Feed, Medicine, Packaging), Unit of Measure (e.g., kg, ltr, pcs), and initial Opening Stock quantity and Value.</w:t>
       </w:r>
     </w:p>
     <w:p>
@@ -2513,15 +2462,7 @@
         <w:t>"Select Excel File"</w:t>
       </w:r>
       <w:r>
-        <w:t> and choose your prepared spreadsheet (.xlsx or .</w:t>
-      </w:r>
-      <w:proofErr w:type="spellStart"/>
-      <w:r>
-        <w:t>xls</w:t>
-      </w:r>
-      <w:proofErr w:type="spellEnd"/>
-      <w:r>
-        <w:t>).</w:t>
+        <w:t> and choose your prepared spreadsheet (.xlsx or .xls).</w:t>
       </w:r>
     </w:p>
     <w:p>
@@ -3015,6 +2956,945 @@
         <w:t>This report lists your company's Assets (e.g., cash, inventory value, money owed by customers) and Liabilities (e.g., money you owe to vendors) to show your total Equity.</w:t>
       </w:r>
     </w:p>
+    <w:p/>
+    <w:p>
+      <w:pPr>
+        <w:rPr>
+          <w:b/>
+          <w:bCs/>
+        </w:rPr>
+      </w:pPr>
+      <w:r>
+        <w:rPr>
+          <w:b/>
+          <w:bCs/>
+        </w:rPr>
+        <w:t>Accounting Workflow</w:t>
+      </w:r>
+    </w:p>
+    <w:p>
+      <w:pPr>
+        <w:rPr>
+          <w:b/>
+          <w:bCs/>
+        </w:rPr>
+      </w:pPr>
+      <w:r>
+        <w:rPr>
+          <w:b/>
+          <w:bCs/>
+        </w:rPr>
+        <w:t>1. Setup and Configuration</w:t>
+      </w:r>
+    </w:p>
+    <w:p>
+      <w:r>
+        <w:t>To enable automated financial tracking, the system requires a Chart of Accounts and specific default account mappings.</w:t>
+      </w:r>
+    </w:p>
+    <w:p>
+      <w:pPr>
+        <w:rPr>
+          <w:b/>
+          <w:bCs/>
+        </w:rPr>
+      </w:pPr>
+      <w:r>
+        <w:rPr>
+          <w:b/>
+          <w:bCs/>
+        </w:rPr>
+        <w:t>1.1. Chart of Accounts</w:t>
+      </w:r>
+    </w:p>
+    <w:p>
+      <w:r>
+        <w:rPr>
+          <w:b/>
+          <w:bCs/>
+        </w:rPr>
+        <w:t>Module:</w:t>
+      </w:r>
+      <w:r>
+        <w:t> Chart of Accounts</w:t>
+      </w:r>
+    </w:p>
+    <w:p>
+      <w:r>
+        <w:t>Users must first define the ledger accounts used for financial transactions.</w:t>
+      </w:r>
+    </w:p>
+    <w:p>
+      <w:pPr>
+        <w:numPr>
+          <w:ilvl w:val="0"/>
+          <w:numId w:val="18"/>
+        </w:numPr>
+      </w:pPr>
+      <w:r>
+        <w:rPr>
+          <w:b/>
+          <w:bCs/>
+        </w:rPr>
+        <w:t>Action:</w:t>
+      </w:r>
+      <w:r>
+        <w:t> Create new accounts.</w:t>
+      </w:r>
+    </w:p>
+    <w:p>
+      <w:pPr>
+        <w:numPr>
+          <w:ilvl w:val="0"/>
+          <w:numId w:val="18"/>
+        </w:numPr>
+      </w:pPr>
+      <w:r>
+        <w:rPr>
+          <w:b/>
+          <w:bCs/>
+        </w:rPr>
+        <w:t>Required Fields:</w:t>
+      </w:r>
+      <w:r>
+        <w:t> Account Code, Account Name, Account Type (Asset, Liability, Equity, Revenue, Expense).</w:t>
+      </w:r>
+    </w:p>
+    <w:p>
+      <w:pPr>
+        <w:rPr>
+          <w:b/>
+          <w:bCs/>
+        </w:rPr>
+      </w:pPr>
+      <w:r>
+        <w:rPr>
+          <w:b/>
+          <w:bCs/>
+        </w:rPr>
+        <w:t>1.2. Financial Settings</w:t>
+      </w:r>
+    </w:p>
+    <w:p>
+      <w:r>
+        <w:rPr>
+          <w:b/>
+          <w:bCs/>
+        </w:rPr>
+        <w:t>Module:</w:t>
+      </w:r>
+      <w:r>
+        <w:t> Configurations</w:t>
+      </w:r>
+    </w:p>
+    <w:p>
+      <w:r>
+        <w:lastRenderedPageBreak/>
+        <w:t>Once accounts are created, they must be mapped to system defaults to automate journal entries.</w:t>
+      </w:r>
+    </w:p>
+    <w:p>
+      <w:pPr>
+        <w:numPr>
+          <w:ilvl w:val="0"/>
+          <w:numId w:val="19"/>
+        </w:numPr>
+      </w:pPr>
+      <w:r>
+        <w:rPr>
+          <w:b/>
+          <w:bCs/>
+        </w:rPr>
+        <w:t>Action:</w:t>
+      </w:r>
+      <w:r>
+        <w:t> Assign default accounts for the following categories:</w:t>
+      </w:r>
+    </w:p>
+    <w:p>
+      <w:pPr>
+        <w:numPr>
+          <w:ilvl w:val="1"/>
+          <w:numId w:val="19"/>
+        </w:numPr>
+      </w:pPr>
+      <w:r>
+        <w:t>Default Cash Account</w:t>
+      </w:r>
+    </w:p>
+    <w:p>
+      <w:pPr>
+        <w:numPr>
+          <w:ilvl w:val="1"/>
+          <w:numId w:val="19"/>
+        </w:numPr>
+      </w:pPr>
+      <w:r>
+        <w:t>Default Sales Account</w:t>
+      </w:r>
+    </w:p>
+    <w:p>
+      <w:pPr>
+        <w:numPr>
+          <w:ilvl w:val="1"/>
+          <w:numId w:val="19"/>
+        </w:numPr>
+      </w:pPr>
+      <w:r>
+        <w:t>Default Inventory Account</w:t>
+      </w:r>
+    </w:p>
+    <w:p>
+      <w:pPr>
+        <w:numPr>
+          <w:ilvl w:val="1"/>
+          <w:numId w:val="19"/>
+        </w:numPr>
+      </w:pPr>
+      <w:r>
+        <w:t>Default COGS (Cost of Goods Sold) Account</w:t>
+      </w:r>
+    </w:p>
+    <w:p>
+      <w:pPr>
+        <w:numPr>
+          <w:ilvl w:val="1"/>
+          <w:numId w:val="19"/>
+        </w:numPr>
+      </w:pPr>
+      <w:r>
+        <w:t>Default Operational Expense Account</w:t>
+      </w:r>
+    </w:p>
+    <w:p>
+      <w:pPr>
+        <w:numPr>
+          <w:ilvl w:val="1"/>
+          <w:numId w:val="19"/>
+        </w:numPr>
+      </w:pPr>
+      <w:r>
+        <w:t>Default Accounts Payable Account</w:t>
+      </w:r>
+    </w:p>
+    <w:p>
+      <w:pPr>
+        <w:numPr>
+          <w:ilvl w:val="1"/>
+          <w:numId w:val="19"/>
+        </w:numPr>
+      </w:pPr>
+      <w:r>
+        <w:t>Default Accounts Receivable Account</w:t>
+      </w:r>
+    </w:p>
+    <w:p>
+      <w:r>
+        <w:pict w14:anchorId="107437D0">
+          <v:rect id="_x0000_i1031" style="width:0;height:1.5pt" o:hralign="center" o:hrstd="t" o:hr="t" fillcolor="#a0a0a0" stroked="f"/>
+        </w:pict>
+      </w:r>
+    </w:p>
+    <w:p>
+      <w:pPr>
+        <w:rPr>
+          <w:b/>
+          <w:bCs/>
+        </w:rPr>
+      </w:pPr>
+      <w:r>
+        <w:rPr>
+          <w:b/>
+          <w:bCs/>
+        </w:rPr>
+        <w:t>2. Automated Journal Entries</w:t>
+      </w:r>
+    </w:p>
+    <w:p>
+      <w:r>
+        <w:t>The system automatically generates journal entries based on operational triggers defined below.</w:t>
+      </w:r>
+    </w:p>
+    <w:p>
+      <w:pPr>
+        <w:rPr>
+          <w:b/>
+          <w:bCs/>
+        </w:rPr>
+      </w:pPr>
+      <w:r>
+        <w:rPr>
+          <w:b/>
+          <w:bCs/>
+        </w:rPr>
+        <w:t>2.1. Purchase Order</w:t>
+      </w:r>
+    </w:p>
+    <w:p>
+      <w:pPr>
+        <w:numPr>
+          <w:ilvl w:val="0"/>
+          <w:numId w:val="20"/>
+        </w:numPr>
+      </w:pPr>
+      <w:r>
+        <w:rPr>
+          <w:b/>
+          <w:bCs/>
+        </w:rPr>
+        <w:t>Trigger:</w:t>
+      </w:r>
+      <w:r>
+        <w:t> A new purchase order is created.</w:t>
+      </w:r>
+    </w:p>
+    <w:p>
+      <w:pPr>
+        <w:numPr>
+          <w:ilvl w:val="0"/>
+          <w:numId w:val="20"/>
+        </w:numPr>
+      </w:pPr>
+      <w:r>
+        <w:rPr>
+          <w:b/>
+          <w:bCs/>
+        </w:rPr>
+        <w:t>Process:</w:t>
+      </w:r>
+      <w:r>
+        <w:t> Records the value of incoming inventory and the obligation to pay the vendor (Accrual Basis).</w:t>
+      </w:r>
+    </w:p>
+    <w:p>
+      <w:pPr>
+        <w:numPr>
+          <w:ilvl w:val="0"/>
+          <w:numId w:val="20"/>
+        </w:numPr>
+      </w:pPr>
+      <w:r>
+        <w:rPr>
+          <w:b/>
+          <w:bCs/>
+        </w:rPr>
+        <w:t>Journal Entry:</w:t>
+      </w:r>
+    </w:p>
+    <w:p>
+      <w:pPr>
+        <w:numPr>
+          <w:ilvl w:val="1"/>
+          <w:numId w:val="20"/>
+        </w:numPr>
+      </w:pPr>
+      <w:r>
+        <w:rPr>
+          <w:b/>
+          <w:bCs/>
+        </w:rPr>
+        <w:t>Debit:</w:t>
+      </w:r>
+      <w:r>
+        <w:t> Inventory Account (Increases Assets)</w:t>
+      </w:r>
+    </w:p>
+    <w:p>
+      <w:pPr>
+        <w:numPr>
+          <w:ilvl w:val="1"/>
+          <w:numId w:val="20"/>
+        </w:numPr>
+      </w:pPr>
+      <w:r>
+        <w:rPr>
+          <w:b/>
+          <w:bCs/>
+        </w:rPr>
+        <w:t>Credit:</w:t>
+      </w:r>
+      <w:r>
+        <w:t> Accounts Payable Account (Increases Liabilities)</w:t>
+      </w:r>
+    </w:p>
+    <w:p>
+      <w:pPr>
+        <w:rPr>
+          <w:b/>
+          <w:bCs/>
+        </w:rPr>
+      </w:pPr>
+      <w:r>
+        <w:rPr>
+          <w:b/>
+          <w:bCs/>
+        </w:rPr>
+        <w:t>2.2. Purchase Payment</w:t>
+      </w:r>
+    </w:p>
+    <w:p>
+      <w:pPr>
+        <w:numPr>
+          <w:ilvl w:val="0"/>
+          <w:numId w:val="21"/>
+        </w:numPr>
+      </w:pPr>
+      <w:r>
+        <w:rPr>
+          <w:b/>
+          <w:bCs/>
+        </w:rPr>
+        <w:t>Trigger:</w:t>
+      </w:r>
+      <w:r>
+        <w:t> A payment is recorded for a purchase order.</w:t>
+      </w:r>
+    </w:p>
+    <w:p>
+      <w:pPr>
+        <w:numPr>
+          <w:ilvl w:val="0"/>
+          <w:numId w:val="21"/>
+        </w:numPr>
+      </w:pPr>
+      <w:r>
+        <w:rPr>
+          <w:b/>
+          <w:bCs/>
+        </w:rPr>
+        <w:t>Process:</w:t>
+      </w:r>
+      <w:r>
+        <w:t> Records the settlement of the vendor bill using cash.</w:t>
+      </w:r>
+    </w:p>
+    <w:p>
+      <w:pPr>
+        <w:numPr>
+          <w:ilvl w:val="0"/>
+          <w:numId w:val="21"/>
+        </w:numPr>
+      </w:pPr>
+      <w:r>
+        <w:rPr>
+          <w:b/>
+          <w:bCs/>
+        </w:rPr>
+        <w:t>Journal Entry:</w:t>
+      </w:r>
+    </w:p>
+    <w:p>
+      <w:pPr>
+        <w:numPr>
+          <w:ilvl w:val="1"/>
+          <w:numId w:val="21"/>
+        </w:numPr>
+      </w:pPr>
+      <w:r>
+        <w:rPr>
+          <w:b/>
+          <w:bCs/>
+        </w:rPr>
+        <w:t>Debit:</w:t>
+      </w:r>
+      <w:r>
+        <w:t> Accounts Payable Account (Decreases Liabilities)</w:t>
+      </w:r>
+    </w:p>
+    <w:p>
+      <w:pPr>
+        <w:numPr>
+          <w:ilvl w:val="1"/>
+          <w:numId w:val="21"/>
+        </w:numPr>
+      </w:pPr>
+      <w:r>
+        <w:rPr>
+          <w:b/>
+          <w:bCs/>
+        </w:rPr>
+        <w:t>Credit:</w:t>
+      </w:r>
+      <w:r>
+        <w:t> Cash Account (Decreases Assets)</w:t>
+      </w:r>
+    </w:p>
+    <w:p>
+      <w:pPr>
+        <w:rPr>
+          <w:b/>
+          <w:bCs/>
+        </w:rPr>
+      </w:pPr>
+      <w:r>
+        <w:rPr>
+          <w:b/>
+          <w:bCs/>
+        </w:rPr>
+        <w:t>2.3. Sales Order</w:t>
+      </w:r>
+    </w:p>
+    <w:p>
+      <w:pPr>
+        <w:numPr>
+          <w:ilvl w:val="0"/>
+          <w:numId w:val="22"/>
+        </w:numPr>
+      </w:pPr>
+      <w:r>
+        <w:rPr>
+          <w:b/>
+          <w:bCs/>
+        </w:rPr>
+        <w:t>Trigger:</w:t>
+      </w:r>
+      <w:r>
+        <w:t> A new sales order is created.</w:t>
+      </w:r>
+    </w:p>
+    <w:p>
+      <w:pPr>
+        <w:numPr>
+          <w:ilvl w:val="0"/>
+          <w:numId w:val="22"/>
+        </w:numPr>
+      </w:pPr>
+      <w:r>
+        <w:rPr>
+          <w:b/>
+          <w:bCs/>
+        </w:rPr>
+        <w:lastRenderedPageBreak/>
+        <w:t>Process:</w:t>
+      </w:r>
+      <w:r>
+        <w:t> Recognizes revenue and the cost of goods sold.</w:t>
+      </w:r>
+    </w:p>
+    <w:p>
+      <w:pPr>
+        <w:numPr>
+          <w:ilvl w:val="0"/>
+          <w:numId w:val="22"/>
+        </w:numPr>
+      </w:pPr>
+      <w:r>
+        <w:rPr>
+          <w:b/>
+          <w:bCs/>
+        </w:rPr>
+        <w:t>Journal Entry 1 (Revenue Recognition):</w:t>
+      </w:r>
+    </w:p>
+    <w:p>
+      <w:pPr>
+        <w:numPr>
+          <w:ilvl w:val="1"/>
+          <w:numId w:val="22"/>
+        </w:numPr>
+      </w:pPr>
+      <w:r>
+        <w:rPr>
+          <w:b/>
+          <w:bCs/>
+        </w:rPr>
+        <w:t>Debit:</w:t>
+      </w:r>
+      <w:r>
+        <w:t> Accounts Receivable Account (Increases Assets)</w:t>
+      </w:r>
+    </w:p>
+    <w:p>
+      <w:pPr>
+        <w:numPr>
+          <w:ilvl w:val="1"/>
+          <w:numId w:val="22"/>
+        </w:numPr>
+      </w:pPr>
+      <w:r>
+        <w:rPr>
+          <w:b/>
+          <w:bCs/>
+        </w:rPr>
+        <w:t>Credit:</w:t>
+      </w:r>
+      <w:r>
+        <w:t> Sales Account (Increases Revenue)</w:t>
+      </w:r>
+    </w:p>
+    <w:p>
+      <w:pPr>
+        <w:numPr>
+          <w:ilvl w:val="0"/>
+          <w:numId w:val="22"/>
+        </w:numPr>
+      </w:pPr>
+      <w:r>
+        <w:rPr>
+          <w:b/>
+          <w:bCs/>
+        </w:rPr>
+        <w:t>Journal Entry 2 (Cost of Goods Sold):</w:t>
+      </w:r>
+    </w:p>
+    <w:p>
+      <w:pPr>
+        <w:numPr>
+          <w:ilvl w:val="1"/>
+          <w:numId w:val="22"/>
+        </w:numPr>
+      </w:pPr>
+      <w:r>
+        <w:rPr>
+          <w:b/>
+          <w:bCs/>
+        </w:rPr>
+        <w:t>Debit:</w:t>
+      </w:r>
+      <w:r>
+        <w:t> Cost of Goods Sold Account (Increases Expenses)</w:t>
+      </w:r>
+    </w:p>
+    <w:p>
+      <w:pPr>
+        <w:numPr>
+          <w:ilvl w:val="1"/>
+          <w:numId w:val="22"/>
+        </w:numPr>
+      </w:pPr>
+      <w:r>
+        <w:rPr>
+          <w:b/>
+          <w:bCs/>
+        </w:rPr>
+        <w:t>Credit:</w:t>
+      </w:r>
+      <w:r>
+        <w:t> Inventory Account (Decreases Assets)</w:t>
+      </w:r>
+    </w:p>
+    <w:p>
+      <w:pPr>
+        <w:rPr>
+          <w:b/>
+          <w:bCs/>
+        </w:rPr>
+      </w:pPr>
+      <w:r>
+        <w:rPr>
+          <w:b/>
+          <w:bCs/>
+        </w:rPr>
+        <w:t>2.4. Sales Payment</w:t>
+      </w:r>
+    </w:p>
+    <w:p>
+      <w:pPr>
+        <w:numPr>
+          <w:ilvl w:val="0"/>
+          <w:numId w:val="23"/>
+        </w:numPr>
+      </w:pPr>
+      <w:r>
+        <w:rPr>
+          <w:b/>
+          <w:bCs/>
+        </w:rPr>
+        <w:t>Trigger:</w:t>
+      </w:r>
+      <w:r>
+        <w:t> A customer payment is recorded for a sales order.</w:t>
+      </w:r>
+    </w:p>
+    <w:p>
+      <w:pPr>
+        <w:numPr>
+          <w:ilvl w:val="0"/>
+          <w:numId w:val="23"/>
+        </w:numPr>
+      </w:pPr>
+      <w:r>
+        <w:rPr>
+          <w:b/>
+          <w:bCs/>
+        </w:rPr>
+        <w:t>Process:</w:t>
+      </w:r>
+      <w:r>
+        <w:t> Records the receipt of cash settling the customer's debt.</w:t>
+      </w:r>
+    </w:p>
+    <w:p>
+      <w:pPr>
+        <w:numPr>
+          <w:ilvl w:val="0"/>
+          <w:numId w:val="23"/>
+        </w:numPr>
+      </w:pPr>
+      <w:r>
+        <w:rPr>
+          <w:b/>
+          <w:bCs/>
+        </w:rPr>
+        <w:t>Journal Entry:</w:t>
+      </w:r>
+    </w:p>
+    <w:p>
+      <w:pPr>
+        <w:numPr>
+          <w:ilvl w:val="1"/>
+          <w:numId w:val="23"/>
+        </w:numPr>
+      </w:pPr>
+      <w:r>
+        <w:rPr>
+          <w:b/>
+          <w:bCs/>
+        </w:rPr>
+        <w:t>Debit:</w:t>
+      </w:r>
+      <w:r>
+        <w:t> Cash Account (Increases Assets)</w:t>
+      </w:r>
+    </w:p>
+    <w:p>
+      <w:pPr>
+        <w:numPr>
+          <w:ilvl w:val="1"/>
+          <w:numId w:val="23"/>
+        </w:numPr>
+      </w:pPr>
+      <w:r>
+        <w:rPr>
+          <w:b/>
+          <w:bCs/>
+        </w:rPr>
+        <w:t>Credit:</w:t>
+      </w:r>
+      <w:r>
+        <w:t> Accounts Receivable Account (Decreases Assets)</w:t>
+      </w:r>
+    </w:p>
+    <w:p>
+      <w:pPr>
+        <w:rPr>
+          <w:b/>
+          <w:bCs/>
+        </w:rPr>
+      </w:pPr>
+      <w:r>
+        <w:rPr>
+          <w:b/>
+          <w:bCs/>
+        </w:rPr>
+        <w:t>2.5. Feed Consumption</w:t>
+      </w:r>
+    </w:p>
+    <w:p>
+      <w:pPr>
+        <w:numPr>
+          <w:ilvl w:val="0"/>
+          <w:numId w:val="24"/>
+        </w:numPr>
+      </w:pPr>
+      <w:r>
+        <w:rPr>
+          <w:b/>
+          <w:bCs/>
+        </w:rPr>
+        <w:t>Trigger:</w:t>
+      </w:r>
+      <w:r>
+        <w:t> A feed composition is marked as "used" for a batch.</w:t>
+      </w:r>
+    </w:p>
+    <w:p>
+      <w:pPr>
+        <w:numPr>
+          <w:ilvl w:val="0"/>
+          <w:numId w:val="24"/>
+        </w:numPr>
+      </w:pPr>
+      <w:r>
+        <w:rPr>
+          <w:b/>
+          <w:bCs/>
+        </w:rPr>
+        <w:t>Process:</w:t>
+      </w:r>
+      <w:r>
+        <w:t> Recognizes the cost of inventory (feed) consumed during the production process.</w:t>
+      </w:r>
+    </w:p>
+    <w:p>
+      <w:pPr>
+        <w:numPr>
+          <w:ilvl w:val="0"/>
+          <w:numId w:val="24"/>
+        </w:numPr>
+      </w:pPr>
+      <w:r>
+        <w:rPr>
+          <w:b/>
+          <w:bCs/>
+        </w:rPr>
+        <w:t>Journal Entry:</w:t>
+      </w:r>
+    </w:p>
+    <w:p>
+      <w:pPr>
+        <w:numPr>
+          <w:ilvl w:val="1"/>
+          <w:numId w:val="24"/>
+        </w:numPr>
+      </w:pPr>
+      <w:r>
+        <w:rPr>
+          <w:b/>
+          <w:bCs/>
+        </w:rPr>
+        <w:t>Debit:</w:t>
+      </w:r>
+      <w:r>
+        <w:t> Cost of Goods Sold Account (Increases Expenses)</w:t>
+      </w:r>
+    </w:p>
+    <w:p>
+      <w:pPr>
+        <w:numPr>
+          <w:ilvl w:val="1"/>
+          <w:numId w:val="24"/>
+        </w:numPr>
+      </w:pPr>
+      <w:r>
+        <w:rPr>
+          <w:b/>
+          <w:bCs/>
+        </w:rPr>
+        <w:t>Credit:</w:t>
+      </w:r>
+      <w:r>
+        <w:t> Inventory Account (Decreases Assets)</w:t>
+      </w:r>
+    </w:p>
+    <w:p>
+      <w:pPr>
+        <w:rPr>
+          <w:b/>
+          <w:bCs/>
+        </w:rPr>
+      </w:pPr>
+      <w:r>
+        <w:rPr>
+          <w:b/>
+          <w:bCs/>
+        </w:rPr>
+        <w:t>2.6. Operational Expenses</w:t>
+      </w:r>
+    </w:p>
+    <w:p>
+      <w:pPr>
+        <w:numPr>
+          <w:ilvl w:val="0"/>
+          <w:numId w:val="25"/>
+        </w:numPr>
+      </w:pPr>
+      <w:r>
+        <w:rPr>
+          <w:b/>
+          <w:bCs/>
+        </w:rPr>
+        <w:t>Trigger:</w:t>
+      </w:r>
+      <w:r>
+        <w:t> A new operational expense is recorded.</w:t>
+      </w:r>
+    </w:p>
+    <w:p>
+      <w:pPr>
+        <w:numPr>
+          <w:ilvl w:val="0"/>
+          <w:numId w:val="25"/>
+        </w:numPr>
+      </w:pPr>
+      <w:r>
+        <w:rPr>
+          <w:b/>
+          <w:bCs/>
+        </w:rPr>
+        <w:t>Process:</w:t>
+      </w:r>
+      <w:r>
+        <w:t> Records a general business expense paid via cash.</w:t>
+      </w:r>
+    </w:p>
+    <w:p>
+      <w:pPr>
+        <w:numPr>
+          <w:ilvl w:val="0"/>
+          <w:numId w:val="25"/>
+        </w:numPr>
+      </w:pPr>
+      <w:r>
+        <w:rPr>
+          <w:b/>
+          <w:bCs/>
+        </w:rPr>
+        <w:t>Journal Entry:</w:t>
+      </w:r>
+    </w:p>
+    <w:p>
+      <w:pPr>
+        <w:numPr>
+          <w:ilvl w:val="1"/>
+          <w:numId w:val="25"/>
+        </w:numPr>
+      </w:pPr>
+      <w:r>
+        <w:rPr>
+          <w:b/>
+          <w:bCs/>
+        </w:rPr>
+        <w:t>Debit:</w:t>
+      </w:r>
+      <w:r>
+        <w:t> Expense Account (Increases Expenses)</w:t>
+      </w:r>
+    </w:p>
+    <w:p>
+      <w:pPr>
+        <w:numPr>
+          <w:ilvl w:val="2"/>
+          <w:numId w:val="25"/>
+        </w:numPr>
+      </w:pPr>
+      <w:r>
+        <w:rPr>
+          <w:i/>
+          <w:iCs/>
+        </w:rPr>
+        <w:t>Note: The system attempts to match the expense type to a specific account; otherwise, it uses the Default Operational Expense Account.</w:t>
+      </w:r>
+    </w:p>
+    <w:p>
+      <w:pPr>
+        <w:numPr>
+          <w:ilvl w:val="1"/>
+          <w:numId w:val="25"/>
+        </w:numPr>
+      </w:pPr>
+      <w:r>
+        <w:rPr>
+          <w:b/>
+          <w:bCs/>
+        </w:rPr>
+        <w:t>Credit:</w:t>
+      </w:r>
+      <w:r>
+        <w:t> Cash Account (Decreases Assets)</w:t>
+      </w:r>
+    </w:p>
+    <w:p/>
     <w:p/>
     <w:p/>
     <w:p/>
@@ -3051,6 +3931,155 @@
 <file path=word/numbering.xml><?xml version="1.0" encoding="utf-8"?>
 <w:numbering xmlns:wpc="http://schemas.microsoft.com/office/word/2010/wordprocessingCanvas" xmlns:cx="http://schemas.microsoft.com/office/drawing/2014/chartex" xmlns:cx1="http://schemas.microsoft.com/office/drawing/2015/9/8/chartex" xmlns:cx2="http://schemas.microsoft.com/office/drawing/2015/10/21/chartex" xmlns:cx3="http://schemas.microsoft.com/office/drawing/2016/5/9/chartex" xmlns:cx4="http://schemas.microsoft.com/office/drawing/2016/5/10/chartex" xmlns:cx5="http://schemas.microsoft.com/office/drawing/2016/5/11/chartex" xmlns:cx6="http://schemas.microsoft.com/office/drawing/2016/5/12/chartex" xmlns:cx7="http://schemas.microsoft.com/office/drawing/2016/5/13/chartex" xmlns:cx8="http://schemas.microsoft.com/office/drawing/2016/5/14/chartex" xmlns:mc="http://schemas.openxmlformats.org/markup-compatibility/2006" xmlns:aink="http://schemas.microsoft.com/office/drawing/2016/ink" xmlns:am3d="http://schemas.microsoft.com/office/drawing/2017/model3d" xmlns:o="urn:schemas-microsoft-com:office:office" xmlns:oel="http://schemas.microsoft.com/office/2019/extlst" xmlns:r="http://schemas.openxmlformats.org/officeDocument/2006/relationships" xmlns:m="http://schemas.openxmlformats.org/officeDocument/2006/math" xmlns:v="urn:schemas-microsoft-com:vml" xmlns:wp14="http://schemas.microsoft.com/office/word/2010/wordprocessingDrawing" xmlns:wp="http://schemas.openxmlformats.org/drawingml/2006/wordprocessingDrawing" xmlns:w10="urn:schemas-microsoft-com:office:word" xmlns:w="http://schemas.openxmlformats.org/wordprocessingml/2006/main" xmlns:w14="http://schemas.microsoft.com/office/word/2010/wordml" xmlns:w15="http://schemas.microsoft.com/office/word/2012/wordml" xmlns:w16cex="http://schemas.microsoft.com/office/word/2018/wordml/cex" xmlns:w16cid="http://schemas.microsoft.com/office/word/2016/wordml/cid" xmlns:w16="http://schemas.microsoft.com/office/word/2018/wordml" xmlns:w16du="http://schemas.microsoft.com/office/word/2023/wordml/word16du" xmlns:w16sdtdh="http://schemas.microsoft.com/office/word/2020/wordml/sdtdatahash" xmlns:w16sdtfl="http://schemas.microsoft.com/office/word/2024/wordml/sdtformatlock" xmlns:w16se="http://schemas.microsoft.com/office/word/2015/wordml/symex" xmlns:wpg="http://schemas.microsoft.com/office/word/2010/wordprocessingGroup" xmlns:wpi="http://schemas.microsoft.com/office/word/2010/wordprocessingInk" xmlns:wne="http://schemas.microsoft.com/office/word/2006/wordml" xmlns:wps="http://schemas.microsoft.com/office/word/2010/wordprocessingShape" mc:Ignorable="w14 w15 w16se w16cid w16 w16cex w16sdtdh w16sdtfl w16du wp14">
   <w:abstractNum w:abstractNumId="0" w15:restartNumberingAfterBreak="0">
+    <w:nsid w:val="04A01AFA"/>
+    <w:multiLevelType w:val="multilevel"/>
+    <w:tmpl w:val="3AF64052"/>
+    <w:lvl w:ilvl="0">
+      <w:start w:val="1"/>
+      <w:numFmt w:val="bullet"/>
+      <w:lvlText w:val=""/>
+      <w:lvlJc w:val="left"/>
+      <w:pPr>
+        <w:tabs>
+          <w:tab w:val="num" w:pos="720"/>
+        </w:tabs>
+        <w:ind w:left="720" w:hanging="360"/>
+      </w:pPr>
+      <w:rPr>
+        <w:rFonts w:ascii="Symbol" w:hAnsi="Symbol" w:hint="default"/>
+        <w:sz w:val="20"/>
+      </w:rPr>
+    </w:lvl>
+    <w:lvl w:ilvl="1" w:tentative="1">
+      <w:start w:val="1"/>
+      <w:numFmt w:val="bullet"/>
+      <w:lvlText w:val="o"/>
+      <w:lvlJc w:val="left"/>
+      <w:pPr>
+        <w:tabs>
+          <w:tab w:val="num" w:pos="1440"/>
+        </w:tabs>
+        <w:ind w:left="1440" w:hanging="360"/>
+      </w:pPr>
+      <w:rPr>
+        <w:rFonts w:ascii="Courier New" w:hAnsi="Courier New" w:hint="default"/>
+        <w:sz w:val="20"/>
+      </w:rPr>
+    </w:lvl>
+    <w:lvl w:ilvl="2" w:tentative="1">
+      <w:start w:val="1"/>
+      <w:numFmt w:val="bullet"/>
+      <w:lvlText w:val=""/>
+      <w:lvlJc w:val="left"/>
+      <w:pPr>
+        <w:tabs>
+          <w:tab w:val="num" w:pos="2160"/>
+        </w:tabs>
+        <w:ind w:left="2160" w:hanging="360"/>
+      </w:pPr>
+      <w:rPr>
+        <w:rFonts w:ascii="Wingdings" w:hAnsi="Wingdings" w:hint="default"/>
+        <w:sz w:val="20"/>
+      </w:rPr>
+    </w:lvl>
+    <w:lvl w:ilvl="3" w:tentative="1">
+      <w:start w:val="1"/>
+      <w:numFmt w:val="bullet"/>
+      <w:lvlText w:val=""/>
+      <w:lvlJc w:val="left"/>
+      <w:pPr>
+        <w:tabs>
+          <w:tab w:val="num" w:pos="2880"/>
+        </w:tabs>
+        <w:ind w:left="2880" w:hanging="360"/>
+      </w:pPr>
+      <w:rPr>
+        <w:rFonts w:ascii="Wingdings" w:hAnsi="Wingdings" w:hint="default"/>
+        <w:sz w:val="20"/>
+      </w:rPr>
+    </w:lvl>
+    <w:lvl w:ilvl="4" w:tentative="1">
+      <w:start w:val="1"/>
+      <w:numFmt w:val="bullet"/>
+      <w:lvlText w:val=""/>
+      <w:lvlJc w:val="left"/>
+      <w:pPr>
+        <w:tabs>
+          <w:tab w:val="num" w:pos="3600"/>
+        </w:tabs>
+        <w:ind w:left="3600" w:hanging="360"/>
+      </w:pPr>
+      <w:rPr>
+        <w:rFonts w:ascii="Wingdings" w:hAnsi="Wingdings" w:hint="default"/>
+        <w:sz w:val="20"/>
+      </w:rPr>
+    </w:lvl>
+    <w:lvl w:ilvl="5" w:tentative="1">
+      <w:start w:val="1"/>
+      <w:numFmt w:val="bullet"/>
+      <w:lvlText w:val=""/>
+      <w:lvlJc w:val="left"/>
+      <w:pPr>
+        <w:tabs>
+          <w:tab w:val="num" w:pos="4320"/>
+        </w:tabs>
+        <w:ind w:left="4320" w:hanging="360"/>
+      </w:pPr>
+      <w:rPr>
+        <w:rFonts w:ascii="Wingdings" w:hAnsi="Wingdings" w:hint="default"/>
+        <w:sz w:val="20"/>
+      </w:rPr>
+    </w:lvl>
+    <w:lvl w:ilvl="6" w:tentative="1">
+      <w:start w:val="1"/>
+      <w:numFmt w:val="bullet"/>
+      <w:lvlText w:val=""/>
+      <w:lvlJc w:val="left"/>
+      <w:pPr>
+        <w:tabs>
+          <w:tab w:val="num" w:pos="5040"/>
+        </w:tabs>
+        <w:ind w:left="5040" w:hanging="360"/>
+      </w:pPr>
+      <w:rPr>
+        <w:rFonts w:ascii="Wingdings" w:hAnsi="Wingdings" w:hint="default"/>
+        <w:sz w:val="20"/>
+      </w:rPr>
+    </w:lvl>
+    <w:lvl w:ilvl="7" w:tentative="1">
+      <w:start w:val="1"/>
+      <w:numFmt w:val="bullet"/>
+      <w:lvlText w:val=""/>
+      <w:lvlJc w:val="left"/>
+      <w:pPr>
+        <w:tabs>
+          <w:tab w:val="num" w:pos="5760"/>
+        </w:tabs>
+        <w:ind w:left="5760" w:hanging="360"/>
+      </w:pPr>
+      <w:rPr>
+        <w:rFonts w:ascii="Wingdings" w:hAnsi="Wingdings" w:hint="default"/>
+        <w:sz w:val="20"/>
+      </w:rPr>
+    </w:lvl>
+    <w:lvl w:ilvl="8" w:tentative="1">
+      <w:start w:val="1"/>
+      <w:numFmt w:val="bullet"/>
+      <w:lvlText w:val=""/>
+      <w:lvlJc w:val="left"/>
+      <w:pPr>
+        <w:tabs>
+          <w:tab w:val="num" w:pos="6480"/>
+        </w:tabs>
+        <w:ind w:left="6480" w:hanging="360"/>
+      </w:pPr>
+      <w:rPr>
+        <w:rFonts w:ascii="Wingdings" w:hAnsi="Wingdings" w:hint="default"/>
+        <w:sz w:val="20"/>
+      </w:rPr>
+    </w:lvl>
+  </w:abstractNum>
+  <w:abstractNum w:abstractNumId="1" w15:restartNumberingAfterBreak="0">
     <w:nsid w:val="0BF73E14"/>
     <w:multiLevelType w:val="multilevel"/>
     <w:tmpl w:val="711CC172"/>
@@ -3199,7 +4228,7 @@
       </w:rPr>
     </w:lvl>
   </w:abstractNum>
-  <w:abstractNum w:abstractNumId="1" w15:restartNumberingAfterBreak="0">
+  <w:abstractNum w:abstractNumId="2" w15:restartNumberingAfterBreak="0">
     <w:nsid w:val="0C2E607B"/>
     <w:multiLevelType w:val="multilevel"/>
     <w:tmpl w:val="23E45568"/>
@@ -3348,7 +4377,7 @@
       </w:rPr>
     </w:lvl>
   </w:abstractNum>
-  <w:abstractNum w:abstractNumId="2" w15:restartNumberingAfterBreak="0">
+  <w:abstractNum w:abstractNumId="3" w15:restartNumberingAfterBreak="0">
     <w:nsid w:val="0E0333CD"/>
     <w:multiLevelType w:val="multilevel"/>
     <w:tmpl w:val="06100560"/>
@@ -3465,7 +4494,305 @@
       </w:pPr>
     </w:lvl>
   </w:abstractNum>
-  <w:abstractNum w:abstractNumId="3" w15:restartNumberingAfterBreak="0">
+  <w:abstractNum w:abstractNumId="4" w15:restartNumberingAfterBreak="0">
+    <w:nsid w:val="10705C7B"/>
+    <w:multiLevelType w:val="multilevel"/>
+    <w:tmpl w:val="360CB7C8"/>
+    <w:lvl w:ilvl="0">
+      <w:start w:val="1"/>
+      <w:numFmt w:val="bullet"/>
+      <w:lvlText w:val=""/>
+      <w:lvlJc w:val="left"/>
+      <w:pPr>
+        <w:tabs>
+          <w:tab w:val="num" w:pos="720"/>
+        </w:tabs>
+        <w:ind w:left="720" w:hanging="360"/>
+      </w:pPr>
+      <w:rPr>
+        <w:rFonts w:ascii="Symbol" w:hAnsi="Symbol" w:hint="default"/>
+        <w:sz w:val="20"/>
+      </w:rPr>
+    </w:lvl>
+    <w:lvl w:ilvl="1">
+      <w:start w:val="1"/>
+      <w:numFmt w:val="bullet"/>
+      <w:lvlText w:val="o"/>
+      <w:lvlJc w:val="left"/>
+      <w:pPr>
+        <w:tabs>
+          <w:tab w:val="num" w:pos="1440"/>
+        </w:tabs>
+        <w:ind w:left="1440" w:hanging="360"/>
+      </w:pPr>
+      <w:rPr>
+        <w:rFonts w:ascii="Courier New" w:hAnsi="Courier New" w:hint="default"/>
+        <w:sz w:val="20"/>
+      </w:rPr>
+    </w:lvl>
+    <w:lvl w:ilvl="2" w:tentative="1">
+      <w:start w:val="1"/>
+      <w:numFmt w:val="bullet"/>
+      <w:lvlText w:val=""/>
+      <w:lvlJc w:val="left"/>
+      <w:pPr>
+        <w:tabs>
+          <w:tab w:val="num" w:pos="2160"/>
+        </w:tabs>
+        <w:ind w:left="2160" w:hanging="360"/>
+      </w:pPr>
+      <w:rPr>
+        <w:rFonts w:ascii="Wingdings" w:hAnsi="Wingdings" w:hint="default"/>
+        <w:sz w:val="20"/>
+      </w:rPr>
+    </w:lvl>
+    <w:lvl w:ilvl="3" w:tentative="1">
+      <w:start w:val="1"/>
+      <w:numFmt w:val="bullet"/>
+      <w:lvlText w:val=""/>
+      <w:lvlJc w:val="left"/>
+      <w:pPr>
+        <w:tabs>
+          <w:tab w:val="num" w:pos="2880"/>
+        </w:tabs>
+        <w:ind w:left="2880" w:hanging="360"/>
+      </w:pPr>
+      <w:rPr>
+        <w:rFonts w:ascii="Wingdings" w:hAnsi="Wingdings" w:hint="default"/>
+        <w:sz w:val="20"/>
+      </w:rPr>
+    </w:lvl>
+    <w:lvl w:ilvl="4" w:tentative="1">
+      <w:start w:val="1"/>
+      <w:numFmt w:val="bullet"/>
+      <w:lvlText w:val=""/>
+      <w:lvlJc w:val="left"/>
+      <w:pPr>
+        <w:tabs>
+          <w:tab w:val="num" w:pos="3600"/>
+        </w:tabs>
+        <w:ind w:left="3600" w:hanging="360"/>
+      </w:pPr>
+      <w:rPr>
+        <w:rFonts w:ascii="Wingdings" w:hAnsi="Wingdings" w:hint="default"/>
+        <w:sz w:val="20"/>
+      </w:rPr>
+    </w:lvl>
+    <w:lvl w:ilvl="5" w:tentative="1">
+      <w:start w:val="1"/>
+      <w:numFmt w:val="bullet"/>
+      <w:lvlText w:val=""/>
+      <w:lvlJc w:val="left"/>
+      <w:pPr>
+        <w:tabs>
+          <w:tab w:val="num" w:pos="4320"/>
+        </w:tabs>
+        <w:ind w:left="4320" w:hanging="360"/>
+      </w:pPr>
+      <w:rPr>
+        <w:rFonts w:ascii="Wingdings" w:hAnsi="Wingdings" w:hint="default"/>
+        <w:sz w:val="20"/>
+      </w:rPr>
+    </w:lvl>
+    <w:lvl w:ilvl="6" w:tentative="1">
+      <w:start w:val="1"/>
+      <w:numFmt w:val="bullet"/>
+      <w:lvlText w:val=""/>
+      <w:lvlJc w:val="left"/>
+      <w:pPr>
+        <w:tabs>
+          <w:tab w:val="num" w:pos="5040"/>
+        </w:tabs>
+        <w:ind w:left="5040" w:hanging="360"/>
+      </w:pPr>
+      <w:rPr>
+        <w:rFonts w:ascii="Wingdings" w:hAnsi="Wingdings" w:hint="default"/>
+        <w:sz w:val="20"/>
+      </w:rPr>
+    </w:lvl>
+    <w:lvl w:ilvl="7" w:tentative="1">
+      <w:start w:val="1"/>
+      <w:numFmt w:val="bullet"/>
+      <w:lvlText w:val=""/>
+      <w:lvlJc w:val="left"/>
+      <w:pPr>
+        <w:tabs>
+          <w:tab w:val="num" w:pos="5760"/>
+        </w:tabs>
+        <w:ind w:left="5760" w:hanging="360"/>
+      </w:pPr>
+      <w:rPr>
+        <w:rFonts w:ascii="Wingdings" w:hAnsi="Wingdings" w:hint="default"/>
+        <w:sz w:val="20"/>
+      </w:rPr>
+    </w:lvl>
+    <w:lvl w:ilvl="8" w:tentative="1">
+      <w:start w:val="1"/>
+      <w:numFmt w:val="bullet"/>
+      <w:lvlText w:val=""/>
+      <w:lvlJc w:val="left"/>
+      <w:pPr>
+        <w:tabs>
+          <w:tab w:val="num" w:pos="6480"/>
+        </w:tabs>
+        <w:ind w:left="6480" w:hanging="360"/>
+      </w:pPr>
+      <w:rPr>
+        <w:rFonts w:ascii="Wingdings" w:hAnsi="Wingdings" w:hint="default"/>
+        <w:sz w:val="20"/>
+      </w:rPr>
+    </w:lvl>
+  </w:abstractNum>
+  <w:abstractNum w:abstractNumId="5" w15:restartNumberingAfterBreak="0">
+    <w:nsid w:val="13152E8F"/>
+    <w:multiLevelType w:val="multilevel"/>
+    <w:tmpl w:val="BD3E69DE"/>
+    <w:lvl w:ilvl="0">
+      <w:start w:val="1"/>
+      <w:numFmt w:val="bullet"/>
+      <w:lvlText w:val=""/>
+      <w:lvlJc w:val="left"/>
+      <w:pPr>
+        <w:tabs>
+          <w:tab w:val="num" w:pos="720"/>
+        </w:tabs>
+        <w:ind w:left="720" w:hanging="360"/>
+      </w:pPr>
+      <w:rPr>
+        <w:rFonts w:ascii="Symbol" w:hAnsi="Symbol" w:hint="default"/>
+        <w:sz w:val="20"/>
+      </w:rPr>
+    </w:lvl>
+    <w:lvl w:ilvl="1">
+      <w:start w:val="1"/>
+      <w:numFmt w:val="bullet"/>
+      <w:lvlText w:val="o"/>
+      <w:lvlJc w:val="left"/>
+      <w:pPr>
+        <w:tabs>
+          <w:tab w:val="num" w:pos="1440"/>
+        </w:tabs>
+        <w:ind w:left="1440" w:hanging="360"/>
+      </w:pPr>
+      <w:rPr>
+        <w:rFonts w:ascii="Courier New" w:hAnsi="Courier New" w:hint="default"/>
+        <w:sz w:val="20"/>
+      </w:rPr>
+    </w:lvl>
+    <w:lvl w:ilvl="2" w:tentative="1">
+      <w:start w:val="1"/>
+      <w:numFmt w:val="bullet"/>
+      <w:lvlText w:val=""/>
+      <w:lvlJc w:val="left"/>
+      <w:pPr>
+        <w:tabs>
+          <w:tab w:val="num" w:pos="2160"/>
+        </w:tabs>
+        <w:ind w:left="2160" w:hanging="360"/>
+      </w:pPr>
+      <w:rPr>
+        <w:rFonts w:ascii="Wingdings" w:hAnsi="Wingdings" w:hint="default"/>
+        <w:sz w:val="20"/>
+      </w:rPr>
+    </w:lvl>
+    <w:lvl w:ilvl="3" w:tentative="1">
+      <w:start w:val="1"/>
+      <w:numFmt w:val="bullet"/>
+      <w:lvlText w:val=""/>
+      <w:lvlJc w:val="left"/>
+      <w:pPr>
+        <w:tabs>
+          <w:tab w:val="num" w:pos="2880"/>
+        </w:tabs>
+        <w:ind w:left="2880" w:hanging="360"/>
+      </w:pPr>
+      <w:rPr>
+        <w:rFonts w:ascii="Wingdings" w:hAnsi="Wingdings" w:hint="default"/>
+        <w:sz w:val="20"/>
+      </w:rPr>
+    </w:lvl>
+    <w:lvl w:ilvl="4" w:tentative="1">
+      <w:start w:val="1"/>
+      <w:numFmt w:val="bullet"/>
+      <w:lvlText w:val=""/>
+      <w:lvlJc w:val="left"/>
+      <w:pPr>
+        <w:tabs>
+          <w:tab w:val="num" w:pos="3600"/>
+        </w:tabs>
+        <w:ind w:left="3600" w:hanging="360"/>
+      </w:pPr>
+      <w:rPr>
+        <w:rFonts w:ascii="Wingdings" w:hAnsi="Wingdings" w:hint="default"/>
+        <w:sz w:val="20"/>
+      </w:rPr>
+    </w:lvl>
+    <w:lvl w:ilvl="5" w:tentative="1">
+      <w:start w:val="1"/>
+      <w:numFmt w:val="bullet"/>
+      <w:lvlText w:val=""/>
+      <w:lvlJc w:val="left"/>
+      <w:pPr>
+        <w:tabs>
+          <w:tab w:val="num" w:pos="4320"/>
+        </w:tabs>
+        <w:ind w:left="4320" w:hanging="360"/>
+      </w:pPr>
+      <w:rPr>
+        <w:rFonts w:ascii="Wingdings" w:hAnsi="Wingdings" w:hint="default"/>
+        <w:sz w:val="20"/>
+      </w:rPr>
+    </w:lvl>
+    <w:lvl w:ilvl="6" w:tentative="1">
+      <w:start w:val="1"/>
+      <w:numFmt w:val="bullet"/>
+      <w:lvlText w:val=""/>
+      <w:lvlJc w:val="left"/>
+      <w:pPr>
+        <w:tabs>
+          <w:tab w:val="num" w:pos="5040"/>
+        </w:tabs>
+        <w:ind w:left="5040" w:hanging="360"/>
+      </w:pPr>
+      <w:rPr>
+        <w:rFonts w:ascii="Wingdings" w:hAnsi="Wingdings" w:hint="default"/>
+        <w:sz w:val="20"/>
+      </w:rPr>
+    </w:lvl>
+    <w:lvl w:ilvl="7" w:tentative="1">
+      <w:start w:val="1"/>
+      <w:numFmt w:val="bullet"/>
+      <w:lvlText w:val=""/>
+      <w:lvlJc w:val="left"/>
+      <w:pPr>
+        <w:tabs>
+          <w:tab w:val="num" w:pos="5760"/>
+        </w:tabs>
+        <w:ind w:left="5760" w:hanging="360"/>
+      </w:pPr>
+      <w:rPr>
+        <w:rFonts w:ascii="Wingdings" w:hAnsi="Wingdings" w:hint="default"/>
+        <w:sz w:val="20"/>
+      </w:rPr>
+    </w:lvl>
+    <w:lvl w:ilvl="8" w:tentative="1">
+      <w:start w:val="1"/>
+      <w:numFmt w:val="bullet"/>
+      <w:lvlText w:val=""/>
+      <w:lvlJc w:val="left"/>
+      <w:pPr>
+        <w:tabs>
+          <w:tab w:val="num" w:pos="6480"/>
+        </w:tabs>
+        <w:ind w:left="6480" w:hanging="360"/>
+      </w:pPr>
+      <w:rPr>
+        <w:rFonts w:ascii="Wingdings" w:hAnsi="Wingdings" w:hint="default"/>
+        <w:sz w:val="20"/>
+      </w:rPr>
+    </w:lvl>
+  </w:abstractNum>
+  <w:abstractNum w:abstractNumId="6" w15:restartNumberingAfterBreak="0">
     <w:nsid w:val="1E9A1FD4"/>
     <w:multiLevelType w:val="multilevel"/>
     <w:tmpl w:val="6F78B47A"/>
@@ -3614,7 +4941,7 @@
       </w:rPr>
     </w:lvl>
   </w:abstractNum>
-  <w:abstractNum w:abstractNumId="4" w15:restartNumberingAfterBreak="0">
+  <w:abstractNum w:abstractNumId="7" w15:restartNumberingAfterBreak="0">
     <w:nsid w:val="21957797"/>
     <w:multiLevelType w:val="multilevel"/>
     <w:tmpl w:val="56AED3C0"/>
@@ -3731,7 +5058,7 @@
       </w:pPr>
     </w:lvl>
   </w:abstractNum>
-  <w:abstractNum w:abstractNumId="5" w15:restartNumberingAfterBreak="0">
+  <w:abstractNum w:abstractNumId="8" w15:restartNumberingAfterBreak="0">
     <w:nsid w:val="2B5B075D"/>
     <w:multiLevelType w:val="multilevel"/>
     <w:tmpl w:val="430A32C6"/>
@@ -3848,7 +5175,7 @@
       </w:pPr>
     </w:lvl>
   </w:abstractNum>
-  <w:abstractNum w:abstractNumId="6" w15:restartNumberingAfterBreak="0">
+  <w:abstractNum w:abstractNumId="9" w15:restartNumberingAfterBreak="0">
     <w:nsid w:val="31315736"/>
     <w:multiLevelType w:val="multilevel"/>
     <w:tmpl w:val="E1F865D6"/>
@@ -3965,7 +5292,7 @@
       </w:pPr>
     </w:lvl>
   </w:abstractNum>
-  <w:abstractNum w:abstractNumId="7" w15:restartNumberingAfterBreak="0">
+  <w:abstractNum w:abstractNumId="10" w15:restartNumberingAfterBreak="0">
     <w:nsid w:val="31C05864"/>
     <w:multiLevelType w:val="multilevel"/>
     <w:tmpl w:val="9B86DF24"/>
@@ -4114,7 +5441,7 @@
       </w:rPr>
     </w:lvl>
   </w:abstractNum>
-  <w:abstractNum w:abstractNumId="8" w15:restartNumberingAfterBreak="0">
+  <w:abstractNum w:abstractNumId="11" w15:restartNumberingAfterBreak="0">
     <w:nsid w:val="324D7156"/>
     <w:multiLevelType w:val="multilevel"/>
     <w:tmpl w:val="65EC9FC2"/>
@@ -4231,7 +5558,305 @@
       </w:pPr>
     </w:lvl>
   </w:abstractNum>
-  <w:abstractNum w:abstractNumId="9" w15:restartNumberingAfterBreak="0">
+  <w:abstractNum w:abstractNumId="12" w15:restartNumberingAfterBreak="0">
+    <w:nsid w:val="35942595"/>
+    <w:multiLevelType w:val="multilevel"/>
+    <w:tmpl w:val="09B0F502"/>
+    <w:lvl w:ilvl="0">
+      <w:start w:val="1"/>
+      <w:numFmt w:val="bullet"/>
+      <w:lvlText w:val=""/>
+      <w:lvlJc w:val="left"/>
+      <w:pPr>
+        <w:tabs>
+          <w:tab w:val="num" w:pos="720"/>
+        </w:tabs>
+        <w:ind w:left="720" w:hanging="360"/>
+      </w:pPr>
+      <w:rPr>
+        <w:rFonts w:ascii="Symbol" w:hAnsi="Symbol" w:hint="default"/>
+        <w:sz w:val="20"/>
+      </w:rPr>
+    </w:lvl>
+    <w:lvl w:ilvl="1">
+      <w:start w:val="1"/>
+      <w:numFmt w:val="bullet"/>
+      <w:lvlText w:val="o"/>
+      <w:lvlJc w:val="left"/>
+      <w:pPr>
+        <w:tabs>
+          <w:tab w:val="num" w:pos="1440"/>
+        </w:tabs>
+        <w:ind w:left="1440" w:hanging="360"/>
+      </w:pPr>
+      <w:rPr>
+        <w:rFonts w:ascii="Courier New" w:hAnsi="Courier New" w:hint="default"/>
+        <w:sz w:val="20"/>
+      </w:rPr>
+    </w:lvl>
+    <w:lvl w:ilvl="2" w:tentative="1">
+      <w:start w:val="1"/>
+      <w:numFmt w:val="bullet"/>
+      <w:lvlText w:val=""/>
+      <w:lvlJc w:val="left"/>
+      <w:pPr>
+        <w:tabs>
+          <w:tab w:val="num" w:pos="2160"/>
+        </w:tabs>
+        <w:ind w:left="2160" w:hanging="360"/>
+      </w:pPr>
+      <w:rPr>
+        <w:rFonts w:ascii="Wingdings" w:hAnsi="Wingdings" w:hint="default"/>
+        <w:sz w:val="20"/>
+      </w:rPr>
+    </w:lvl>
+    <w:lvl w:ilvl="3" w:tentative="1">
+      <w:start w:val="1"/>
+      <w:numFmt w:val="bullet"/>
+      <w:lvlText w:val=""/>
+      <w:lvlJc w:val="left"/>
+      <w:pPr>
+        <w:tabs>
+          <w:tab w:val="num" w:pos="2880"/>
+        </w:tabs>
+        <w:ind w:left="2880" w:hanging="360"/>
+      </w:pPr>
+      <w:rPr>
+        <w:rFonts w:ascii="Wingdings" w:hAnsi="Wingdings" w:hint="default"/>
+        <w:sz w:val="20"/>
+      </w:rPr>
+    </w:lvl>
+    <w:lvl w:ilvl="4" w:tentative="1">
+      <w:start w:val="1"/>
+      <w:numFmt w:val="bullet"/>
+      <w:lvlText w:val=""/>
+      <w:lvlJc w:val="left"/>
+      <w:pPr>
+        <w:tabs>
+          <w:tab w:val="num" w:pos="3600"/>
+        </w:tabs>
+        <w:ind w:left="3600" w:hanging="360"/>
+      </w:pPr>
+      <w:rPr>
+        <w:rFonts w:ascii="Wingdings" w:hAnsi="Wingdings" w:hint="default"/>
+        <w:sz w:val="20"/>
+      </w:rPr>
+    </w:lvl>
+    <w:lvl w:ilvl="5" w:tentative="1">
+      <w:start w:val="1"/>
+      <w:numFmt w:val="bullet"/>
+      <w:lvlText w:val=""/>
+      <w:lvlJc w:val="left"/>
+      <w:pPr>
+        <w:tabs>
+          <w:tab w:val="num" w:pos="4320"/>
+        </w:tabs>
+        <w:ind w:left="4320" w:hanging="360"/>
+      </w:pPr>
+      <w:rPr>
+        <w:rFonts w:ascii="Wingdings" w:hAnsi="Wingdings" w:hint="default"/>
+        <w:sz w:val="20"/>
+      </w:rPr>
+    </w:lvl>
+    <w:lvl w:ilvl="6" w:tentative="1">
+      <w:start w:val="1"/>
+      <w:numFmt w:val="bullet"/>
+      <w:lvlText w:val=""/>
+      <w:lvlJc w:val="left"/>
+      <w:pPr>
+        <w:tabs>
+          <w:tab w:val="num" w:pos="5040"/>
+        </w:tabs>
+        <w:ind w:left="5040" w:hanging="360"/>
+      </w:pPr>
+      <w:rPr>
+        <w:rFonts w:ascii="Wingdings" w:hAnsi="Wingdings" w:hint="default"/>
+        <w:sz w:val="20"/>
+      </w:rPr>
+    </w:lvl>
+    <w:lvl w:ilvl="7" w:tentative="1">
+      <w:start w:val="1"/>
+      <w:numFmt w:val="bullet"/>
+      <w:lvlText w:val=""/>
+      <w:lvlJc w:val="left"/>
+      <w:pPr>
+        <w:tabs>
+          <w:tab w:val="num" w:pos="5760"/>
+        </w:tabs>
+        <w:ind w:left="5760" w:hanging="360"/>
+      </w:pPr>
+      <w:rPr>
+        <w:rFonts w:ascii="Wingdings" w:hAnsi="Wingdings" w:hint="default"/>
+        <w:sz w:val="20"/>
+      </w:rPr>
+    </w:lvl>
+    <w:lvl w:ilvl="8" w:tentative="1">
+      <w:start w:val="1"/>
+      <w:numFmt w:val="bullet"/>
+      <w:lvlText w:val=""/>
+      <w:lvlJc w:val="left"/>
+      <w:pPr>
+        <w:tabs>
+          <w:tab w:val="num" w:pos="6480"/>
+        </w:tabs>
+        <w:ind w:left="6480" w:hanging="360"/>
+      </w:pPr>
+      <w:rPr>
+        <w:rFonts w:ascii="Wingdings" w:hAnsi="Wingdings" w:hint="default"/>
+        <w:sz w:val="20"/>
+      </w:rPr>
+    </w:lvl>
+  </w:abstractNum>
+  <w:abstractNum w:abstractNumId="13" w15:restartNumberingAfterBreak="0">
+    <w:nsid w:val="37B60AF7"/>
+    <w:multiLevelType w:val="multilevel"/>
+    <w:tmpl w:val="AA4EE3B0"/>
+    <w:lvl w:ilvl="0">
+      <w:start w:val="1"/>
+      <w:numFmt w:val="bullet"/>
+      <w:lvlText w:val=""/>
+      <w:lvlJc w:val="left"/>
+      <w:pPr>
+        <w:tabs>
+          <w:tab w:val="num" w:pos="720"/>
+        </w:tabs>
+        <w:ind w:left="720" w:hanging="360"/>
+      </w:pPr>
+      <w:rPr>
+        <w:rFonts w:ascii="Symbol" w:hAnsi="Symbol" w:hint="default"/>
+        <w:sz w:val="20"/>
+      </w:rPr>
+    </w:lvl>
+    <w:lvl w:ilvl="1">
+      <w:start w:val="1"/>
+      <w:numFmt w:val="bullet"/>
+      <w:lvlText w:val="o"/>
+      <w:lvlJc w:val="left"/>
+      <w:pPr>
+        <w:tabs>
+          <w:tab w:val="num" w:pos="1440"/>
+        </w:tabs>
+        <w:ind w:left="1440" w:hanging="360"/>
+      </w:pPr>
+      <w:rPr>
+        <w:rFonts w:ascii="Courier New" w:hAnsi="Courier New" w:hint="default"/>
+        <w:sz w:val="20"/>
+      </w:rPr>
+    </w:lvl>
+    <w:lvl w:ilvl="2" w:tentative="1">
+      <w:start w:val="1"/>
+      <w:numFmt w:val="bullet"/>
+      <w:lvlText w:val=""/>
+      <w:lvlJc w:val="left"/>
+      <w:pPr>
+        <w:tabs>
+          <w:tab w:val="num" w:pos="2160"/>
+        </w:tabs>
+        <w:ind w:left="2160" w:hanging="360"/>
+      </w:pPr>
+      <w:rPr>
+        <w:rFonts w:ascii="Wingdings" w:hAnsi="Wingdings" w:hint="default"/>
+        <w:sz w:val="20"/>
+      </w:rPr>
+    </w:lvl>
+    <w:lvl w:ilvl="3" w:tentative="1">
+      <w:start w:val="1"/>
+      <w:numFmt w:val="bullet"/>
+      <w:lvlText w:val=""/>
+      <w:lvlJc w:val="left"/>
+      <w:pPr>
+        <w:tabs>
+          <w:tab w:val="num" w:pos="2880"/>
+        </w:tabs>
+        <w:ind w:left="2880" w:hanging="360"/>
+      </w:pPr>
+      <w:rPr>
+        <w:rFonts w:ascii="Wingdings" w:hAnsi="Wingdings" w:hint="default"/>
+        <w:sz w:val="20"/>
+      </w:rPr>
+    </w:lvl>
+    <w:lvl w:ilvl="4" w:tentative="1">
+      <w:start w:val="1"/>
+      <w:numFmt w:val="bullet"/>
+      <w:lvlText w:val=""/>
+      <w:lvlJc w:val="left"/>
+      <w:pPr>
+        <w:tabs>
+          <w:tab w:val="num" w:pos="3600"/>
+        </w:tabs>
+        <w:ind w:left="3600" w:hanging="360"/>
+      </w:pPr>
+      <w:rPr>
+        <w:rFonts w:ascii="Wingdings" w:hAnsi="Wingdings" w:hint="default"/>
+        <w:sz w:val="20"/>
+      </w:rPr>
+    </w:lvl>
+    <w:lvl w:ilvl="5" w:tentative="1">
+      <w:start w:val="1"/>
+      <w:numFmt w:val="bullet"/>
+      <w:lvlText w:val=""/>
+      <w:lvlJc w:val="left"/>
+      <w:pPr>
+        <w:tabs>
+          <w:tab w:val="num" w:pos="4320"/>
+        </w:tabs>
+        <w:ind w:left="4320" w:hanging="360"/>
+      </w:pPr>
+      <w:rPr>
+        <w:rFonts w:ascii="Wingdings" w:hAnsi="Wingdings" w:hint="default"/>
+        <w:sz w:val="20"/>
+      </w:rPr>
+    </w:lvl>
+    <w:lvl w:ilvl="6" w:tentative="1">
+      <w:start w:val="1"/>
+      <w:numFmt w:val="bullet"/>
+      <w:lvlText w:val=""/>
+      <w:lvlJc w:val="left"/>
+      <w:pPr>
+        <w:tabs>
+          <w:tab w:val="num" w:pos="5040"/>
+        </w:tabs>
+        <w:ind w:left="5040" w:hanging="360"/>
+      </w:pPr>
+      <w:rPr>
+        <w:rFonts w:ascii="Wingdings" w:hAnsi="Wingdings" w:hint="default"/>
+        <w:sz w:val="20"/>
+      </w:rPr>
+    </w:lvl>
+    <w:lvl w:ilvl="7" w:tentative="1">
+      <w:start w:val="1"/>
+      <w:numFmt w:val="bullet"/>
+      <w:lvlText w:val=""/>
+      <w:lvlJc w:val="left"/>
+      <w:pPr>
+        <w:tabs>
+          <w:tab w:val="num" w:pos="5760"/>
+        </w:tabs>
+        <w:ind w:left="5760" w:hanging="360"/>
+      </w:pPr>
+      <w:rPr>
+        <w:rFonts w:ascii="Wingdings" w:hAnsi="Wingdings" w:hint="default"/>
+        <w:sz w:val="20"/>
+      </w:rPr>
+    </w:lvl>
+    <w:lvl w:ilvl="8" w:tentative="1">
+      <w:start w:val="1"/>
+      <w:numFmt w:val="bullet"/>
+      <w:lvlText w:val=""/>
+      <w:lvlJc w:val="left"/>
+      <w:pPr>
+        <w:tabs>
+          <w:tab w:val="num" w:pos="6480"/>
+        </w:tabs>
+        <w:ind w:left="6480" w:hanging="360"/>
+      </w:pPr>
+      <w:rPr>
+        <w:rFonts w:ascii="Wingdings" w:hAnsi="Wingdings" w:hint="default"/>
+        <w:sz w:val="20"/>
+      </w:rPr>
+    </w:lvl>
+  </w:abstractNum>
+  <w:abstractNum w:abstractNumId="14" w15:restartNumberingAfterBreak="0">
     <w:nsid w:val="477102D1"/>
     <w:multiLevelType w:val="multilevel"/>
     <w:tmpl w:val="70028158"/>
@@ -4380,7 +6005,7 @@
       </w:rPr>
     </w:lvl>
   </w:abstractNum>
-  <w:abstractNum w:abstractNumId="10" w15:restartNumberingAfterBreak="0">
+  <w:abstractNum w:abstractNumId="15" w15:restartNumberingAfterBreak="0">
     <w:nsid w:val="4DE45820"/>
     <w:multiLevelType w:val="multilevel"/>
     <w:tmpl w:val="098E08F2"/>
@@ -4497,7 +6122,7 @@
       </w:pPr>
     </w:lvl>
   </w:abstractNum>
-  <w:abstractNum w:abstractNumId="11" w15:restartNumberingAfterBreak="0">
+  <w:abstractNum w:abstractNumId="16" w15:restartNumberingAfterBreak="0">
     <w:nsid w:val="4F232625"/>
     <w:multiLevelType w:val="multilevel"/>
     <w:tmpl w:val="0ACEE1EE"/>
@@ -4618,7 +6243,156 @@
       </w:pPr>
     </w:lvl>
   </w:abstractNum>
-  <w:abstractNum w:abstractNumId="12" w15:restartNumberingAfterBreak="0">
+  <w:abstractNum w:abstractNumId="17" w15:restartNumberingAfterBreak="0">
+    <w:nsid w:val="57AB1294"/>
+    <w:multiLevelType w:val="multilevel"/>
+    <w:tmpl w:val="C246AB7A"/>
+    <w:lvl w:ilvl="0">
+      <w:start w:val="1"/>
+      <w:numFmt w:val="bullet"/>
+      <w:lvlText w:val=""/>
+      <w:lvlJc w:val="left"/>
+      <w:pPr>
+        <w:tabs>
+          <w:tab w:val="num" w:pos="720"/>
+        </w:tabs>
+        <w:ind w:left="720" w:hanging="360"/>
+      </w:pPr>
+      <w:rPr>
+        <w:rFonts w:ascii="Symbol" w:hAnsi="Symbol" w:hint="default"/>
+        <w:sz w:val="20"/>
+      </w:rPr>
+    </w:lvl>
+    <w:lvl w:ilvl="1">
+      <w:start w:val="1"/>
+      <w:numFmt w:val="bullet"/>
+      <w:lvlText w:val="o"/>
+      <w:lvlJc w:val="left"/>
+      <w:pPr>
+        <w:tabs>
+          <w:tab w:val="num" w:pos="1440"/>
+        </w:tabs>
+        <w:ind w:left="1440" w:hanging="360"/>
+      </w:pPr>
+      <w:rPr>
+        <w:rFonts w:ascii="Courier New" w:hAnsi="Courier New" w:hint="default"/>
+        <w:sz w:val="20"/>
+      </w:rPr>
+    </w:lvl>
+    <w:lvl w:ilvl="2" w:tentative="1">
+      <w:start w:val="1"/>
+      <w:numFmt w:val="bullet"/>
+      <w:lvlText w:val=""/>
+      <w:lvlJc w:val="left"/>
+      <w:pPr>
+        <w:tabs>
+          <w:tab w:val="num" w:pos="2160"/>
+        </w:tabs>
+        <w:ind w:left="2160" w:hanging="360"/>
+      </w:pPr>
+      <w:rPr>
+        <w:rFonts w:ascii="Wingdings" w:hAnsi="Wingdings" w:hint="default"/>
+        <w:sz w:val="20"/>
+      </w:rPr>
+    </w:lvl>
+    <w:lvl w:ilvl="3" w:tentative="1">
+      <w:start w:val="1"/>
+      <w:numFmt w:val="bullet"/>
+      <w:lvlText w:val=""/>
+      <w:lvlJc w:val="left"/>
+      <w:pPr>
+        <w:tabs>
+          <w:tab w:val="num" w:pos="2880"/>
+        </w:tabs>
+        <w:ind w:left="2880" w:hanging="360"/>
+      </w:pPr>
+      <w:rPr>
+        <w:rFonts w:ascii="Wingdings" w:hAnsi="Wingdings" w:hint="default"/>
+        <w:sz w:val="20"/>
+      </w:rPr>
+    </w:lvl>
+    <w:lvl w:ilvl="4" w:tentative="1">
+      <w:start w:val="1"/>
+      <w:numFmt w:val="bullet"/>
+      <w:lvlText w:val=""/>
+      <w:lvlJc w:val="left"/>
+      <w:pPr>
+        <w:tabs>
+          <w:tab w:val="num" w:pos="3600"/>
+        </w:tabs>
+        <w:ind w:left="3600" w:hanging="360"/>
+      </w:pPr>
+      <w:rPr>
+        <w:rFonts w:ascii="Wingdings" w:hAnsi="Wingdings" w:hint="default"/>
+        <w:sz w:val="20"/>
+      </w:rPr>
+    </w:lvl>
+    <w:lvl w:ilvl="5" w:tentative="1">
+      <w:start w:val="1"/>
+      <w:numFmt w:val="bullet"/>
+      <w:lvlText w:val=""/>
+      <w:lvlJc w:val="left"/>
+      <w:pPr>
+        <w:tabs>
+          <w:tab w:val="num" w:pos="4320"/>
+        </w:tabs>
+        <w:ind w:left="4320" w:hanging="360"/>
+      </w:pPr>
+      <w:rPr>
+        <w:rFonts w:ascii="Wingdings" w:hAnsi="Wingdings" w:hint="default"/>
+        <w:sz w:val="20"/>
+      </w:rPr>
+    </w:lvl>
+    <w:lvl w:ilvl="6" w:tentative="1">
+      <w:start w:val="1"/>
+      <w:numFmt w:val="bullet"/>
+      <w:lvlText w:val=""/>
+      <w:lvlJc w:val="left"/>
+      <w:pPr>
+        <w:tabs>
+          <w:tab w:val="num" w:pos="5040"/>
+        </w:tabs>
+        <w:ind w:left="5040" w:hanging="360"/>
+      </w:pPr>
+      <w:rPr>
+        <w:rFonts w:ascii="Wingdings" w:hAnsi="Wingdings" w:hint="default"/>
+        <w:sz w:val="20"/>
+      </w:rPr>
+    </w:lvl>
+    <w:lvl w:ilvl="7" w:tentative="1">
+      <w:start w:val="1"/>
+      <w:numFmt w:val="bullet"/>
+      <w:lvlText w:val=""/>
+      <w:lvlJc w:val="left"/>
+      <w:pPr>
+        <w:tabs>
+          <w:tab w:val="num" w:pos="5760"/>
+        </w:tabs>
+        <w:ind w:left="5760" w:hanging="360"/>
+      </w:pPr>
+      <w:rPr>
+        <w:rFonts w:ascii="Wingdings" w:hAnsi="Wingdings" w:hint="default"/>
+        <w:sz w:val="20"/>
+      </w:rPr>
+    </w:lvl>
+    <w:lvl w:ilvl="8" w:tentative="1">
+      <w:start w:val="1"/>
+      <w:numFmt w:val="bullet"/>
+      <w:lvlText w:val=""/>
+      <w:lvlJc w:val="left"/>
+      <w:pPr>
+        <w:tabs>
+          <w:tab w:val="num" w:pos="6480"/>
+        </w:tabs>
+        <w:ind w:left="6480" w:hanging="360"/>
+      </w:pPr>
+      <w:rPr>
+        <w:rFonts w:ascii="Wingdings" w:hAnsi="Wingdings" w:hint="default"/>
+        <w:sz w:val="20"/>
+      </w:rPr>
+    </w:lvl>
+  </w:abstractNum>
+  <w:abstractNum w:abstractNumId="18" w15:restartNumberingAfterBreak="0">
     <w:nsid w:val="59846D31"/>
     <w:multiLevelType w:val="multilevel"/>
     <w:tmpl w:val="6DC23030"/>
@@ -4735,7 +6509,7 @@
       </w:pPr>
     </w:lvl>
   </w:abstractNum>
-  <w:abstractNum w:abstractNumId="13" w15:restartNumberingAfterBreak="0">
+  <w:abstractNum w:abstractNumId="19" w15:restartNumberingAfterBreak="0">
     <w:nsid w:val="691D55BA"/>
     <w:multiLevelType w:val="multilevel"/>
     <w:tmpl w:val="0A3E3346"/>
@@ -4848,7 +6622,156 @@
       </w:pPr>
     </w:lvl>
   </w:abstractNum>
-  <w:abstractNum w:abstractNumId="14" w15:restartNumberingAfterBreak="0">
+  <w:abstractNum w:abstractNumId="20" w15:restartNumberingAfterBreak="0">
+    <w:nsid w:val="6C345597"/>
+    <w:multiLevelType w:val="multilevel"/>
+    <w:tmpl w:val="7E9CAFAC"/>
+    <w:lvl w:ilvl="0">
+      <w:start w:val="1"/>
+      <w:numFmt w:val="bullet"/>
+      <w:lvlText w:val=""/>
+      <w:lvlJc w:val="left"/>
+      <w:pPr>
+        <w:tabs>
+          <w:tab w:val="num" w:pos="720"/>
+        </w:tabs>
+        <w:ind w:left="720" w:hanging="360"/>
+      </w:pPr>
+      <w:rPr>
+        <w:rFonts w:ascii="Symbol" w:hAnsi="Symbol" w:hint="default"/>
+        <w:sz w:val="20"/>
+      </w:rPr>
+    </w:lvl>
+    <w:lvl w:ilvl="1">
+      <w:start w:val="1"/>
+      <w:numFmt w:val="bullet"/>
+      <w:lvlText w:val="o"/>
+      <w:lvlJc w:val="left"/>
+      <w:pPr>
+        <w:tabs>
+          <w:tab w:val="num" w:pos="1440"/>
+        </w:tabs>
+        <w:ind w:left="1440" w:hanging="360"/>
+      </w:pPr>
+      <w:rPr>
+        <w:rFonts w:ascii="Courier New" w:hAnsi="Courier New" w:hint="default"/>
+        <w:sz w:val="20"/>
+      </w:rPr>
+    </w:lvl>
+    <w:lvl w:ilvl="2">
+      <w:start w:val="1"/>
+      <w:numFmt w:val="bullet"/>
+      <w:lvlText w:val=""/>
+      <w:lvlJc w:val="left"/>
+      <w:pPr>
+        <w:tabs>
+          <w:tab w:val="num" w:pos="2160"/>
+        </w:tabs>
+        <w:ind w:left="2160" w:hanging="360"/>
+      </w:pPr>
+      <w:rPr>
+        <w:rFonts w:ascii="Wingdings" w:hAnsi="Wingdings" w:hint="default"/>
+        <w:sz w:val="20"/>
+      </w:rPr>
+    </w:lvl>
+    <w:lvl w:ilvl="3" w:tentative="1">
+      <w:start w:val="1"/>
+      <w:numFmt w:val="bullet"/>
+      <w:lvlText w:val=""/>
+      <w:lvlJc w:val="left"/>
+      <w:pPr>
+        <w:tabs>
+          <w:tab w:val="num" w:pos="2880"/>
+        </w:tabs>
+        <w:ind w:left="2880" w:hanging="360"/>
+      </w:pPr>
+      <w:rPr>
+        <w:rFonts w:ascii="Wingdings" w:hAnsi="Wingdings" w:hint="default"/>
+        <w:sz w:val="20"/>
+      </w:rPr>
+    </w:lvl>
+    <w:lvl w:ilvl="4" w:tentative="1">
+      <w:start w:val="1"/>
+      <w:numFmt w:val="bullet"/>
+      <w:lvlText w:val=""/>
+      <w:lvlJc w:val="left"/>
+      <w:pPr>
+        <w:tabs>
+          <w:tab w:val="num" w:pos="3600"/>
+        </w:tabs>
+        <w:ind w:left="3600" w:hanging="360"/>
+      </w:pPr>
+      <w:rPr>
+        <w:rFonts w:ascii="Wingdings" w:hAnsi="Wingdings" w:hint="default"/>
+        <w:sz w:val="20"/>
+      </w:rPr>
+    </w:lvl>
+    <w:lvl w:ilvl="5" w:tentative="1">
+      <w:start w:val="1"/>
+      <w:numFmt w:val="bullet"/>
+      <w:lvlText w:val=""/>
+      <w:lvlJc w:val="left"/>
+      <w:pPr>
+        <w:tabs>
+          <w:tab w:val="num" w:pos="4320"/>
+        </w:tabs>
+        <w:ind w:left="4320" w:hanging="360"/>
+      </w:pPr>
+      <w:rPr>
+        <w:rFonts w:ascii="Wingdings" w:hAnsi="Wingdings" w:hint="default"/>
+        <w:sz w:val="20"/>
+      </w:rPr>
+    </w:lvl>
+    <w:lvl w:ilvl="6" w:tentative="1">
+      <w:start w:val="1"/>
+      <w:numFmt w:val="bullet"/>
+      <w:lvlText w:val=""/>
+      <w:lvlJc w:val="left"/>
+      <w:pPr>
+        <w:tabs>
+          <w:tab w:val="num" w:pos="5040"/>
+        </w:tabs>
+        <w:ind w:left="5040" w:hanging="360"/>
+      </w:pPr>
+      <w:rPr>
+        <w:rFonts w:ascii="Wingdings" w:hAnsi="Wingdings" w:hint="default"/>
+        <w:sz w:val="20"/>
+      </w:rPr>
+    </w:lvl>
+    <w:lvl w:ilvl="7" w:tentative="1">
+      <w:start w:val="1"/>
+      <w:numFmt w:val="bullet"/>
+      <w:lvlText w:val=""/>
+      <w:lvlJc w:val="left"/>
+      <w:pPr>
+        <w:tabs>
+          <w:tab w:val="num" w:pos="5760"/>
+        </w:tabs>
+        <w:ind w:left="5760" w:hanging="360"/>
+      </w:pPr>
+      <w:rPr>
+        <w:rFonts w:ascii="Wingdings" w:hAnsi="Wingdings" w:hint="default"/>
+        <w:sz w:val="20"/>
+      </w:rPr>
+    </w:lvl>
+    <w:lvl w:ilvl="8" w:tentative="1">
+      <w:start w:val="1"/>
+      <w:numFmt w:val="bullet"/>
+      <w:lvlText w:val=""/>
+      <w:lvlJc w:val="left"/>
+      <w:pPr>
+        <w:tabs>
+          <w:tab w:val="num" w:pos="6480"/>
+        </w:tabs>
+        <w:ind w:left="6480" w:hanging="360"/>
+      </w:pPr>
+      <w:rPr>
+        <w:rFonts w:ascii="Wingdings" w:hAnsi="Wingdings" w:hint="default"/>
+        <w:sz w:val="20"/>
+      </w:rPr>
+    </w:lvl>
+  </w:abstractNum>
+  <w:abstractNum w:abstractNumId="21" w15:restartNumberingAfterBreak="0">
     <w:nsid w:val="7799010F"/>
     <w:multiLevelType w:val="multilevel"/>
     <w:tmpl w:val="B7D2A216"/>
@@ -4969,7 +6892,7 @@
       </w:pPr>
     </w:lvl>
   </w:abstractNum>
-  <w:abstractNum w:abstractNumId="15" w15:restartNumberingAfterBreak="0">
+  <w:abstractNum w:abstractNumId="22" w15:restartNumberingAfterBreak="0">
     <w:nsid w:val="785F1A02"/>
     <w:multiLevelType w:val="multilevel"/>
     <w:tmpl w:val="EC6A24AC"/>
@@ -5086,7 +7009,156 @@
       </w:pPr>
     </w:lvl>
   </w:abstractNum>
-  <w:abstractNum w:abstractNumId="16" w15:restartNumberingAfterBreak="0">
+  <w:abstractNum w:abstractNumId="23" w15:restartNumberingAfterBreak="0">
+    <w:nsid w:val="796E54B3"/>
+    <w:multiLevelType w:val="multilevel"/>
+    <w:tmpl w:val="5CAA5212"/>
+    <w:lvl w:ilvl="0">
+      <w:start w:val="1"/>
+      <w:numFmt w:val="bullet"/>
+      <w:lvlText w:val=""/>
+      <w:lvlJc w:val="left"/>
+      <w:pPr>
+        <w:tabs>
+          <w:tab w:val="num" w:pos="720"/>
+        </w:tabs>
+        <w:ind w:left="720" w:hanging="360"/>
+      </w:pPr>
+      <w:rPr>
+        <w:rFonts w:ascii="Symbol" w:hAnsi="Symbol" w:hint="default"/>
+        <w:sz w:val="20"/>
+      </w:rPr>
+    </w:lvl>
+    <w:lvl w:ilvl="1">
+      <w:start w:val="1"/>
+      <w:numFmt w:val="bullet"/>
+      <w:lvlText w:val="o"/>
+      <w:lvlJc w:val="left"/>
+      <w:pPr>
+        <w:tabs>
+          <w:tab w:val="num" w:pos="1440"/>
+        </w:tabs>
+        <w:ind w:left="1440" w:hanging="360"/>
+      </w:pPr>
+      <w:rPr>
+        <w:rFonts w:ascii="Courier New" w:hAnsi="Courier New" w:hint="default"/>
+        <w:sz w:val="20"/>
+      </w:rPr>
+    </w:lvl>
+    <w:lvl w:ilvl="2" w:tentative="1">
+      <w:start w:val="1"/>
+      <w:numFmt w:val="bullet"/>
+      <w:lvlText w:val=""/>
+      <w:lvlJc w:val="left"/>
+      <w:pPr>
+        <w:tabs>
+          <w:tab w:val="num" w:pos="2160"/>
+        </w:tabs>
+        <w:ind w:left="2160" w:hanging="360"/>
+      </w:pPr>
+      <w:rPr>
+        <w:rFonts w:ascii="Wingdings" w:hAnsi="Wingdings" w:hint="default"/>
+        <w:sz w:val="20"/>
+      </w:rPr>
+    </w:lvl>
+    <w:lvl w:ilvl="3" w:tentative="1">
+      <w:start w:val="1"/>
+      <w:numFmt w:val="bullet"/>
+      <w:lvlText w:val=""/>
+      <w:lvlJc w:val="left"/>
+      <w:pPr>
+        <w:tabs>
+          <w:tab w:val="num" w:pos="2880"/>
+        </w:tabs>
+        <w:ind w:left="2880" w:hanging="360"/>
+      </w:pPr>
+      <w:rPr>
+        <w:rFonts w:ascii="Wingdings" w:hAnsi="Wingdings" w:hint="default"/>
+        <w:sz w:val="20"/>
+      </w:rPr>
+    </w:lvl>
+    <w:lvl w:ilvl="4" w:tentative="1">
+      <w:start w:val="1"/>
+      <w:numFmt w:val="bullet"/>
+      <w:lvlText w:val=""/>
+      <w:lvlJc w:val="left"/>
+      <w:pPr>
+        <w:tabs>
+          <w:tab w:val="num" w:pos="3600"/>
+        </w:tabs>
+        <w:ind w:left="3600" w:hanging="360"/>
+      </w:pPr>
+      <w:rPr>
+        <w:rFonts w:ascii="Wingdings" w:hAnsi="Wingdings" w:hint="default"/>
+        <w:sz w:val="20"/>
+      </w:rPr>
+    </w:lvl>
+    <w:lvl w:ilvl="5" w:tentative="1">
+      <w:start w:val="1"/>
+      <w:numFmt w:val="bullet"/>
+      <w:lvlText w:val=""/>
+      <w:lvlJc w:val="left"/>
+      <w:pPr>
+        <w:tabs>
+          <w:tab w:val="num" w:pos="4320"/>
+        </w:tabs>
+        <w:ind w:left="4320" w:hanging="360"/>
+      </w:pPr>
+      <w:rPr>
+        <w:rFonts w:ascii="Wingdings" w:hAnsi="Wingdings" w:hint="default"/>
+        <w:sz w:val="20"/>
+      </w:rPr>
+    </w:lvl>
+    <w:lvl w:ilvl="6" w:tentative="1">
+      <w:start w:val="1"/>
+      <w:numFmt w:val="bullet"/>
+      <w:lvlText w:val=""/>
+      <w:lvlJc w:val="left"/>
+      <w:pPr>
+        <w:tabs>
+          <w:tab w:val="num" w:pos="5040"/>
+        </w:tabs>
+        <w:ind w:left="5040" w:hanging="360"/>
+      </w:pPr>
+      <w:rPr>
+        <w:rFonts w:ascii="Wingdings" w:hAnsi="Wingdings" w:hint="default"/>
+        <w:sz w:val="20"/>
+      </w:rPr>
+    </w:lvl>
+    <w:lvl w:ilvl="7" w:tentative="1">
+      <w:start w:val="1"/>
+      <w:numFmt w:val="bullet"/>
+      <w:lvlText w:val=""/>
+      <w:lvlJc w:val="left"/>
+      <w:pPr>
+        <w:tabs>
+          <w:tab w:val="num" w:pos="5760"/>
+        </w:tabs>
+        <w:ind w:left="5760" w:hanging="360"/>
+      </w:pPr>
+      <w:rPr>
+        <w:rFonts w:ascii="Wingdings" w:hAnsi="Wingdings" w:hint="default"/>
+        <w:sz w:val="20"/>
+      </w:rPr>
+    </w:lvl>
+    <w:lvl w:ilvl="8" w:tentative="1">
+      <w:start w:val="1"/>
+      <w:numFmt w:val="bullet"/>
+      <w:lvlText w:val=""/>
+      <w:lvlJc w:val="left"/>
+      <w:pPr>
+        <w:tabs>
+          <w:tab w:val="num" w:pos="6480"/>
+        </w:tabs>
+        <w:ind w:left="6480" w:hanging="360"/>
+      </w:pPr>
+      <w:rPr>
+        <w:rFonts w:ascii="Wingdings" w:hAnsi="Wingdings" w:hint="default"/>
+        <w:sz w:val="20"/>
+      </w:rPr>
+    </w:lvl>
+  </w:abstractNum>
+  <w:abstractNum w:abstractNumId="24" w15:restartNumberingAfterBreak="0">
     <w:nsid w:val="7E1A7F35"/>
     <w:multiLevelType w:val="multilevel"/>
     <w:tmpl w:val="BA109216"/>
@@ -5200,55 +7272,79 @@
     </w:lvl>
   </w:abstractNum>
   <w:num w:numId="1" w16cid:durableId="876166933">
+    <w:abstractNumId w:val="11"/>
+  </w:num>
+  <w:num w:numId="2" w16cid:durableId="1436484567">
+    <w:abstractNumId w:val="14"/>
+  </w:num>
+  <w:num w:numId="3" w16cid:durableId="1348749168">
+    <w:abstractNumId w:val="21"/>
+  </w:num>
+  <w:num w:numId="4" w16cid:durableId="1924678104">
+    <w:abstractNumId w:val="16"/>
+  </w:num>
+  <w:num w:numId="5" w16cid:durableId="1416823258">
+    <w:abstractNumId w:val="15"/>
+  </w:num>
+  <w:num w:numId="6" w16cid:durableId="747265381">
+    <w:abstractNumId w:val="6"/>
+  </w:num>
+  <w:num w:numId="7" w16cid:durableId="425855753">
+    <w:abstractNumId w:val="9"/>
+  </w:num>
+  <w:num w:numId="8" w16cid:durableId="472409595">
+    <w:abstractNumId w:val="22"/>
+  </w:num>
+  <w:num w:numId="9" w16cid:durableId="92895440">
+    <w:abstractNumId w:val="7"/>
+  </w:num>
+  <w:num w:numId="10" w16cid:durableId="1422332719">
+    <w:abstractNumId w:val="3"/>
+  </w:num>
+  <w:num w:numId="11" w16cid:durableId="388845327">
+    <w:abstractNumId w:val="18"/>
+  </w:num>
+  <w:num w:numId="12" w16cid:durableId="377776784">
     <w:abstractNumId w:val="8"/>
   </w:num>
-  <w:num w:numId="2" w16cid:durableId="1436484567">
-    <w:abstractNumId w:val="9"/>
+  <w:num w:numId="13" w16cid:durableId="902254950">
+    <w:abstractNumId w:val="19"/>
   </w:num>
-  <w:num w:numId="3" w16cid:durableId="1348749168">
-    <w:abstractNumId w:val="14"/>
+  <w:num w:numId="14" w16cid:durableId="1745645859">
+    <w:abstractNumId w:val="2"/>
   </w:num>
-  <w:num w:numId="4" w16cid:durableId="1924678104">
-    <w:abstractNumId w:val="11"/>
+  <w:num w:numId="15" w16cid:durableId="1985766993">
+    <w:abstractNumId w:val="1"/>
   </w:num>
-  <w:num w:numId="5" w16cid:durableId="1416823258">
+  <w:num w:numId="16" w16cid:durableId="1888494087">
+    <w:abstractNumId w:val="24"/>
+  </w:num>
+  <w:num w:numId="17" w16cid:durableId="245965025">
     <w:abstractNumId w:val="10"/>
   </w:num>
-  <w:num w:numId="6" w16cid:durableId="747265381">
-    <w:abstractNumId w:val="3"/>
+  <w:num w:numId="18" w16cid:durableId="1776048971">
+    <w:abstractNumId w:val="0"/>
   </w:num>
-  <w:num w:numId="7" w16cid:durableId="425855753">
-    <w:abstractNumId w:val="6"/>
-  </w:num>
-  <w:num w:numId="8" w16cid:durableId="472409595">
-    <w:abstractNumId w:val="15"/>
-  </w:num>
-  <w:num w:numId="9" w16cid:durableId="92895440">
+  <w:num w:numId="19" w16cid:durableId="1978680400">
     <w:abstractNumId w:val="4"/>
   </w:num>
-  <w:num w:numId="10" w16cid:durableId="1422332719">
-    <w:abstractNumId w:val="2"/>
+  <w:num w:numId="20" w16cid:durableId="2087720240">
+    <w:abstractNumId w:val="23"/>
   </w:num>
-  <w:num w:numId="11" w16cid:durableId="388845327">
+  <w:num w:numId="21" w16cid:durableId="1652556254">
+    <w:abstractNumId w:val="5"/>
+  </w:num>
+  <w:num w:numId="22" w16cid:durableId="77754229">
+    <w:abstractNumId w:val="17"/>
+  </w:num>
+  <w:num w:numId="23" w16cid:durableId="971323486">
+    <w:abstractNumId w:val="13"/>
+  </w:num>
+  <w:num w:numId="24" w16cid:durableId="1885487160">
     <w:abstractNumId w:val="12"/>
   </w:num>
-  <w:num w:numId="12" w16cid:durableId="377776784">
-    <w:abstractNumId w:val="5"/>
-  </w:num>
-  <w:num w:numId="13" w16cid:durableId="902254950">
-    <w:abstractNumId w:val="13"/>
-  </w:num>
-  <w:num w:numId="14" w16cid:durableId="1745645859">
-    <w:abstractNumId w:val="1"/>
-  </w:num>
-  <w:num w:numId="15" w16cid:durableId="1985766993">
-    <w:abstractNumId w:val="0"/>
-  </w:num>
-  <w:num w:numId="16" w16cid:durableId="1888494087">
-    <w:abstractNumId w:val="16"/>
-  </w:num>
-  <w:num w:numId="17" w16cid:durableId="245965025">
-    <w:abstractNumId w:val="7"/>
+  <w:num w:numId="25" w16cid:durableId="108016540">
+    <w:abstractNumId w:val="20"/>
   </w:num>
 </w:numbering>
 </file>
@@ -6169,6 +8265,29 @@
       <w:spacing w:val="5"/>
     </w:rPr>
   </w:style>
+  <w:style w:type="character" w:styleId="Hyperlink">
+    <w:name w:val="Hyperlink"/>
+    <w:basedOn w:val="DefaultParagraphFont"/>
+    <w:uiPriority w:val="99"/>
+    <w:unhideWhenUsed/>
+    <w:rsid w:val="00C104F5"/>
+    <w:rPr>
+      <w:color w:val="467886" w:themeColor="hyperlink"/>
+      <w:u w:val="single"/>
+    </w:rPr>
+  </w:style>
+  <w:style w:type="character" w:styleId="UnresolvedMention">
+    <w:name w:val="Unresolved Mention"/>
+    <w:basedOn w:val="DefaultParagraphFont"/>
+    <w:uiPriority w:val="99"/>
+    <w:semiHidden/>
+    <w:unhideWhenUsed/>
+    <w:rsid w:val="00C104F5"/>
+    <w:rPr>
+      <w:color w:val="605E5C"/>
+      <w:shd w:val="clear" w:color="auto" w:fill="E1DFDD"/>
+    </w:rPr>
+  </w:style>
 </w:styles>
 </file>
 

</xml_diff>